<commit_message>
Record design discussion #3 (feature treatment) as planning doc 09
Skew/log1p, scaling (RobustScaler primary + StandardScaler experiment),
and the weighting/redundancy analysis (AvgBasket = M/F deterministic
redundancy; cluster on R/F/M/Tenure; equal weight as earned baseline +
business-weighted & whitened as tracked experiments).

Co-Authored-By: Claude Opus 4.8 (1M context) <noreply@anthropic.com>
</commit_message>
<xml_diff>
--- a/planning/docs/00_Project_Overview.docx
+++ b/planning/docs/00_Project_Overview.docx
@@ -598,6 +598,36 @@
           </w:p>
         </w:tc>
       </w:tr>
+      <w:tr>
+        <w:tc>
+          <w:tcPr>
+            <w:tcW w:type="dxa" w:w="4320"/>
+          </w:tcPr>
+          <w:p>
+            <w:r/>
+            <w:r>
+              <w:rPr>
+                <w:sz w:val="20"/>
+              </w:rPr>
+              <w:t>09_Feature_Treatment</w:t>
+            </w:r>
+          </w:p>
+        </w:tc>
+        <w:tc>
+          <w:tcPr>
+            <w:tcW w:type="dxa" w:w="4320"/>
+          </w:tcPr>
+          <w:p>
+            <w:r/>
+            <w:r>
+              <w:rPr>
+                <w:sz w:val="20"/>
+              </w:rPr>
+              <w:t>Design discussion #3 - skew/log, scaling (Robust vs Standard), weighting &amp; redundancy</w:t>
+            </w:r>
+          </w:p>
+        </w:tc>
+      </w:tr>
     </w:tbl>
     <w:p/>
     <w:p>

</xml_diff>

<commit_message>
Record clustering discussion as planning docs 10-11
10_Choosing_and_Validating_K: three-leg framework, internal indices
(elbow/silhouette/gap/CH/DB), stability (bootstrap Jaccard/consensus/
seed ARI), decision procedure.
11_Clustering_Method_Comparison: continuum->why K-Means interview
answer, K-Means/GMM/hierarchical in depth, DBSCAN why-not, ARI/BIC
comparison machinery.

Co-Authored-By: Claude Opus 4.8 (1M context) <noreply@anthropic.com>
</commit_message>
<xml_diff>
--- a/planning/docs/00_Project_Overview.docx
+++ b/planning/docs/00_Project_Overview.docx
@@ -628,6 +628,66 @@
           </w:p>
         </w:tc>
       </w:tr>
+      <w:tr>
+        <w:tc>
+          <w:tcPr>
+            <w:tcW w:type="dxa" w:w="4320"/>
+          </w:tcPr>
+          <w:p>
+            <w:r/>
+            <w:r>
+              <w:rPr>
+                <w:sz w:val="20"/>
+              </w:rPr>
+              <w:t>10_Choosing_and_Validating_K</w:t>
+            </w:r>
+          </w:p>
+        </w:tc>
+        <w:tc>
+          <w:tcPr>
+            <w:tcW w:type="dxa" w:w="4320"/>
+          </w:tcPr>
+          <w:p>
+            <w:r/>
+            <w:r>
+              <w:rPr>
+                <w:sz w:val="20"/>
+              </w:rPr>
+              <w:t>Design discussion #4 - choosing K (elbow/silhouette/gap/CH/DB) + stability (bootstrap/consensus)</w:t>
+            </w:r>
+          </w:p>
+        </w:tc>
+      </w:tr>
+      <w:tr>
+        <w:tc>
+          <w:tcPr>
+            <w:tcW w:type="dxa" w:w="4320"/>
+          </w:tcPr>
+          <w:p>
+            <w:r/>
+            <w:r>
+              <w:rPr>
+                <w:sz w:val="20"/>
+              </w:rPr>
+              <w:t>11_Clustering_Method_Comparison</w:t>
+            </w:r>
+          </w:p>
+        </w:tc>
+        <w:tc>
+          <w:tcPr>
+            <w:tcW w:type="dxa" w:w="4320"/>
+          </w:tcPr>
+          <w:p>
+            <w:r/>
+            <w:r>
+              <w:rPr>
+                <w:sz w:val="20"/>
+              </w:rPr>
+              <w:t>Design discussion #5 - K-Means vs GMM vs hierarchical; the continuum question; ARI/BIC</w:t>
+            </w:r>
+          </w:p>
+        </w:tc>
+      </w:tr>
     </w:tbl>
     <w:p/>
     <w:p>

</xml_diff>

<commit_message>
Record design discussion #6 (CLV<->segments integration) as planning doc 12
CLV as a separate post-hoc layer joined on Customer ID (never a
clustering input - circularity/interpretability), internal-consistency
validation, and the segment x CLV action grid. Horizon=12mo, optional
DCF, P(alive) bonus signal.

Co-Authored-By: Claude Opus 4.8 (1M context) <noreply@anthropic.com>
</commit_message>
<xml_diff>
--- a/planning/docs/00_Project_Overview.docx
+++ b/planning/docs/00_Project_Overview.docx
@@ -688,6 +688,36 @@
           </w:p>
         </w:tc>
       </w:tr>
+      <w:tr>
+        <w:tc>
+          <w:tcPr>
+            <w:tcW w:type="dxa" w:w="4320"/>
+          </w:tcPr>
+          <w:p>
+            <w:r/>
+            <w:r>
+              <w:rPr>
+                <w:sz w:val="20"/>
+              </w:rPr>
+              <w:t>12_CLV_and_Segments_Integration</w:t>
+            </w:r>
+          </w:p>
+        </w:tc>
+        <w:tc>
+          <w:tcPr>
+            <w:tcW w:type="dxa" w:w="4320"/>
+          </w:tcPr>
+          <w:p>
+            <w:r/>
+            <w:r>
+              <w:rPr>
+                <w:sz w:val="20"/>
+              </w:rPr>
+              <w:t>Design discussion #6 - CLV as a separate post-hoc layer joined on Customer ID; the segment x CLV grid</w:t>
+            </w:r>
+          </w:p>
+        </w:tc>
+      </w:tr>
     </w:tbl>
     <w:p/>
     <w:p>

</xml_diff>

<commit_message>
Record design discussion #7 (segment naming) as planning docs 13-14
13_Segment_Profiling_and_Validation: profiling discipline (raw units,
per-column business meaning, n% calculation, naming after inspection)
+ 3-tier validation (KW/effect-size, classifier, external-variable
gold standard, rule-based RFM cross-tab).
14_Recommendations_and_Success_Criteria: action/value-at-stake grid,
segment x CLV refinement, 5 success criteria, final deliverables.

Co-Authored-By: Claude Opus 4.8 (1M context) <noreply@anthropic.com>
</commit_message>
<xml_diff>
--- a/planning/docs/00_Project_Overview.docx
+++ b/planning/docs/00_Project_Overview.docx
@@ -718,6 +718,66 @@
           </w:p>
         </w:tc>
       </w:tr>
+      <w:tr>
+        <w:tc>
+          <w:tcPr>
+            <w:tcW w:type="dxa" w:w="4320"/>
+          </w:tcPr>
+          <w:p>
+            <w:r/>
+            <w:r>
+              <w:rPr>
+                <w:sz w:val="20"/>
+              </w:rPr>
+              <w:t>13_Segment_Profiling_and_Validation</w:t>
+            </w:r>
+          </w:p>
+        </w:tc>
+        <w:tc>
+          <w:tcPr>
+            <w:tcW w:type="dxa" w:w="4320"/>
+          </w:tcPr>
+          <w:p>
+            <w:r/>
+            <w:r>
+              <w:rPr>
+                <w:sz w:val="20"/>
+              </w:rPr>
+              <w:t>Design discussion #7a - profiling clusters into named personas; validating they are real (3 tiers)</w:t>
+            </w:r>
+          </w:p>
+        </w:tc>
+      </w:tr>
+      <w:tr>
+        <w:tc>
+          <w:tcPr>
+            <w:tcW w:type="dxa" w:w="4320"/>
+          </w:tcPr>
+          <w:p>
+            <w:r/>
+            <w:r>
+              <w:rPr>
+                <w:sz w:val="20"/>
+              </w:rPr>
+              <w:t>14_Recommendations_and_Success_Criteria</w:t>
+            </w:r>
+          </w:p>
+        </w:tc>
+        <w:tc>
+          <w:tcPr>
+            <w:tcW w:type="dxa" w:w="4320"/>
+          </w:tcPr>
+          <w:p>
+            <w:r/>
+            <w:r>
+              <w:rPr>
+                <w:sz w:val="20"/>
+              </w:rPr>
+              <w:t>Design discussion #7b - the action/value-at-stake grid; what 'good' means for the project</w:t>
+            </w:r>
+          </w:p>
+        </w:tc>
+      </w:tr>
     </w:tbl>
     <w:p/>
     <w:p>

</xml_diff>

<commit_message>
Record design discussion #8 (BG/NBD + Gamma-Gamma CLV engine) as planning doc 15
Non-contractual problem, the frequency/recency naming trap vs clustering
RFM, BG/NBD two-process model (Poisson-Gamma buying + Beta-Geometric
dropout, P(alive)), Gamma-Gamma shrinkage + freq-monetary independence
gate, CLV combination, assumptions, and the lifetimes pipeline.

Co-Authored-By: Claude Opus 4.8 (1M context) <noreply@anthropic.com>
</commit_message>
<xml_diff>
--- a/planning/docs/00_Project_Overview.docx
+++ b/planning/docs/00_Project_Overview.docx
@@ -778,6 +778,36 @@
           </w:p>
         </w:tc>
       </w:tr>
+      <w:tr>
+        <w:tc>
+          <w:tcPr>
+            <w:tcW w:type="dxa" w:w="4320"/>
+          </w:tcPr>
+          <w:p>
+            <w:r/>
+            <w:r>
+              <w:rPr>
+                <w:sz w:val="20"/>
+              </w:rPr>
+              <w:t>15_BGNBD_GammaGamma_CLV_Engine</w:t>
+            </w:r>
+          </w:p>
+        </w:tc>
+        <w:tc>
+          <w:tcPr>
+            <w:tcW w:type="dxa" w:w="4320"/>
+          </w:tcPr>
+          <w:p>
+            <w:r/>
+            <w:r>
+              <w:rPr>
+                <w:sz w:val="20"/>
+              </w:rPr>
+              <w:t>Design discussion #8 - the probabilistic CLV model (BG/NBD + Gamma-Gamma) in depth</w:t>
+            </w:r>
+          </w:p>
+        </w:tc>
+      </w:tr>
     </w:tbl>
     <w:p/>
     <w:p>

</xml_diff>

<commit_message>
planning: add data-cleaning (doc 16) + feature-engineering (doc 17); patch doc 04 Tenure def
Co-Authored-By: Claude Opus 4.8 (1M context) <noreply@anthropic.com>
</commit_message>
<xml_diff>
--- a/planning/docs/00_Project_Overview.docx
+++ b/planning/docs/00_Project_Overview.docx
@@ -808,6 +808,66 @@
           </w:p>
         </w:tc>
       </w:tr>
+      <w:tr>
+        <w:tc>
+          <w:tcPr>
+            <w:tcW w:type="dxa" w:w="4320"/>
+          </w:tcPr>
+          <w:p>
+            <w:r/>
+            <w:r>
+              <w:rPr>
+                <w:sz w:val="20"/>
+              </w:rPr>
+              <w:t>16_Data_Cleaning_Decisions</w:t>
+            </w:r>
+          </w:p>
+        </w:tc>
+        <w:tc>
+          <w:tcPr>
+            <w:tcW w:type="dxa" w:w="4320"/>
+          </w:tcPr>
+          <w:p>
+            <w:r/>
+            <w:r>
+              <w:rPr>
+                <w:sz w:val="20"/>
+              </w:rPr>
+              <w:t>Design discussion #9 - the pre-processing logic: drop returns, invalid-records list, wholesaler flag placement</w:t>
+            </w:r>
+          </w:p>
+        </w:tc>
+      </w:tr>
+      <w:tr>
+        <w:tc>
+          <w:tcPr>
+            <w:tcW w:type="dxa" w:w="4320"/>
+          </w:tcPr>
+          <w:p>
+            <w:r/>
+            <w:r>
+              <w:rPr>
+                <w:sz w:val="20"/>
+              </w:rPr>
+              <w:t>17_Feature_Engineering</w:t>
+            </w:r>
+          </w:p>
+        </w:tc>
+        <w:tc>
+          <w:tcPr>
+            <w:tcW w:type="dxa" w:w="4320"/>
+          </w:tcPr>
+          <w:p>
+            <w:r/>
+            <w:r>
+              <w:rPr>
+                <w:sz w:val="20"/>
+              </w:rPr>
+              <w:t>Design discussion #10 - collapse transactions to customer features in 3 lanes; Tenure/transform/single-purchase decisions</w:t>
+            </w:r>
+          </w:p>
+        </w:tc>
+      </w:tr>
     </w:tbl>
     <w:p/>
     <w:p>

</xml_diff>

<commit_message>
planning: doc 15 CLV pipeline -> PyMC-Marketing; add doc 18 (library & language strategy)
Co-Authored-By: Claude Opus 4.8 (1M context) <noreply@anthropic.com>
</commit_message>
<xml_diff>
--- a/planning/docs/00_Project_Overview.docx
+++ b/planning/docs/00_Project_Overview.docx
@@ -868,6 +868,36 @@
           </w:p>
         </w:tc>
       </w:tr>
+      <w:tr>
+        <w:tc>
+          <w:tcPr>
+            <w:tcW w:type="dxa" w:w="4320"/>
+          </w:tcPr>
+          <w:p>
+            <w:r/>
+            <w:r>
+              <w:rPr>
+                <w:sz w:val="20"/>
+              </w:rPr>
+              <w:t>18_CLV_Library_and_Language_Strategy</w:t>
+            </w:r>
+          </w:p>
+        </w:tc>
+        <w:tc>
+          <w:tcPr>
+            <w:tcW w:type="dxa" w:w="4320"/>
+          </w:tcPr>
+          <w:p>
+            <w:r/>
+            <w:r>
+              <w:rPr>
+                <w:sz w:val="20"/>
+              </w:rPr>
+              <w:t>Design discussion #11 - switch lifetimes -&gt; PyMC-Marketing (Bayesian, Python 3.12); Python-primary + R cross-validation</w:t>
+            </w:r>
+          </w:p>
+        </w:tc>
+      </w:tr>
     </w:tbl>
     <w:p/>
     <w:p>

</xml_diff>